<commit_message>
thêm md báo cáo
</commit_message>
<xml_diff>
--- a/archive/Bao_cao/CNTT_KLCN182_LeDucLuong.docx
+++ b/archive/Bao_cao/CNTT_KLCN182_LeDucLuong.docx
@@ -2899,7 +2899,7 @@
                 <w:rFonts w:ascii="Times New Roman" w:hAnsi="Times New Roman"/>
                 <w:sz w:val="22"/>
               </w:rPr>
-              <w:t>+0.0036 (+0.49%)</w:t>
+              <w:t>+0.0036 (+0.50%)</w:t>
             </w:r>
           </w:p>
         </w:tc>
@@ -2922,7 +2922,7 @@
                 <w:rFonts w:ascii="Times New Roman" w:hAnsi="Times New Roman"/>
                 <w:sz w:val="22"/>
               </w:rPr>
-              <w:t>[0.7065, 0.7339]</w:t>
+              <w:t>[0.7065, 0.7338]</w:t>
             </w:r>
           </w:p>
         </w:tc>
@@ -2945,7 +2945,7 @@
                 <w:rFonts w:ascii="Times New Roman" w:hAnsi="Times New Roman"/>
                 <w:sz w:val="22"/>
               </w:rPr>
-              <w:t>p = 0.3839 (Thu hẹp Std -39.7%)</w:t>
+              <w:t>p = 0.3839 (Thu hẹp Std -39.5%)</w:t>
             </w:r>
           </w:p>
         </w:tc>
@@ -3042,7 +3042,7 @@
                 <w:rFonts w:ascii="Times New Roman" w:hAnsi="Times New Roman"/>
                 <w:sz w:val="22"/>
               </w:rPr>
-              <w:t>-0.0056 (-0.62%)</w:t>
+              <w:t>-0.0057 (-0.63%)</w:t>
             </w:r>
           </w:p>
         </w:tc>
@@ -3088,7 +3088,7 @@
                 <w:rFonts w:ascii="Times New Roman" w:hAnsi="Times New Roman"/>
                 <w:sz w:val="22"/>
               </w:rPr>
-              <w:t>p = 0.2273 (Tiệm cận tương đương)</w:t>
+              <w:t>p = 0.2319 (Tiệm cận tương đương)</w:t>
             </w:r>
           </w:p>
         </w:tc>
@@ -3231,7 +3231,7 @@
                 <w:rFonts w:ascii="Times New Roman" w:hAnsi="Times New Roman"/>
                 <w:sz w:val="22"/>
               </w:rPr>
-              <w:t>p = 0.5428 (Lọc biên chính xác hơn)</w:t>
+              <w:t>p = 0.4439 (Lọc biên chính xác hơn)</w:t>
             </w:r>
           </w:p>
         </w:tc>
@@ -3374,7 +3374,7 @@
                 <w:rFonts w:ascii="Times New Roman" w:hAnsi="Times New Roman"/>
                 <w:sz w:val="22"/>
               </w:rPr>
-              <w:t>p = 0.5907 (Tăng độ nhạy bắt polyp)</w:t>
+              <w:t>p = 0.7027 (Tăng độ nhạy bắt polyp)</w:t>
             </w:r>
           </w:p>
         </w:tc>
@@ -3517,7 +3517,7 @@
                 <w:rFonts w:ascii="Times New Roman" w:hAnsi="Times New Roman"/>
                 <w:sz w:val="22"/>
               </w:rPr>
-              <w:t>p = 0.7152 (Giảm độ phân tán -28.6%)</w:t>
+              <w:t>p = 0.7677 (Giảm độ phân tán -28.8%)</w:t>
             </w:r>
           </w:p>
         </w:tc>
@@ -3614,7 +3614,7 @@
                 <w:rFonts w:ascii="Times New Roman" w:hAnsi="Times New Roman"/>
                 <w:sz w:val="22"/>
               </w:rPr>
-              <w:t>-0.0004 (-0.05%)</w:t>
+              <w:t>-0.0005 (-0.06%)</w:t>
             </w:r>
           </w:p>
         </w:tc>
@@ -3637,7 +3637,7 @@
                 <w:rFonts w:ascii="Times New Roman" w:hAnsi="Times New Roman"/>
                 <w:sz w:val="22"/>
               </w:rPr>
-              <w:t>[0.8846, 0.9113]</w:t>
+              <w:t>[0.8879, 0.9157]</w:t>
             </w:r>
           </w:p>
         </w:tc>
@@ -3660,7 +3660,7 @@
                 <w:rFonts w:ascii="Times New Roman" w:hAnsi="Times New Roman"/>
                 <w:sz w:val="22"/>
               </w:rPr>
-              <w:t>p = 0.9334 (Bảo toàn định vị khung bao)</w:t>
+              <w:t>p = 0.9189 (Bảo toàn định vị khung bao)</w:t>
             </w:r>
           </w:p>
         </w:tc>
@@ -3780,7 +3780,7 @@
                 <w:rFonts w:ascii="Times New Roman" w:hAnsi="Times New Roman"/>
                 <w:sz w:val="22"/>
               </w:rPr>
-              <w:t>[0.8347, 0.8779]</w:t>
+              <w:t>[0.8354, 0.8873]</w:t>
             </w:r>
           </w:p>
         </w:tc>
@@ -3803,7 +3803,7 @@
                 <w:rFonts w:ascii="Times New Roman" w:hAnsi="Times New Roman"/>
                 <w:sz w:val="22"/>
               </w:rPr>
-              <w:t>p = 0.2674 (Tăng trưởng mạnh nhất)</w:t>
+              <w:t>p = 0.2887 (Tăng trưởng mạnh nhất)</w:t>
             </w:r>
           </w:p>
         </w:tc>
@@ -3900,7 +3900,7 @@
                 <w:rFonts w:ascii="Times New Roman" w:hAnsi="Times New Roman"/>
                 <w:sz w:val="22"/>
               </w:rPr>
-              <w:t>-0.0622 (-4.76%)</w:t>
+              <w:t>-0.0621 (-4.76%)</w:t>
             </w:r>
           </w:p>
         </w:tc>
@@ -3952,20 +3952,6 @@
         </w:tc>
       </w:tr>
     </w:tbl>
-    <w:p>
-      <w:pPr>
-        <w:spacing w:before="60" w:after="60" w:line="300" w:lineRule="auto"/>
-        <w:ind w:firstLine="720"/>
-        <w:jc w:val="both"/>
-      </w:pPr>
-      <w:r>
-        <w:rPr>
-          <w:rFonts w:ascii="Times New Roman" w:hAnsi="Times New Roman"/>
-          <w:sz w:val="26"/>
-        </w:rPr>
-        <w:t>Ghi chú: Với cỡ mẫu N = 10 lần chạy độc lập, KHÔNG chỉ số nào đạt mức ý nghĩa thống kê ở ngưỡng α = 0.05. Chỉ Validation Segmentation Loss tiệm cận ngưỡng α = 0.10 (p = 0.0908). Các khác biệt về giá trị trung bình là xu hướng thực nghiệm, chưa đủ bằng chứng thống kê để bác bỏ giả thuyết không. Đóng góp quan sát được rõ nhất của TSVM nằm ở mức độ ổn định phương sai (Std giảm 39.7%, phương sai co 2.75 lần) và giảm hàm mất mát phân đoạn. Toàn bộ số liệu trong bảng đã được kiểm chứng lại 100% từ 20 tệp results.csv gốc của các lượt huấn luyện.</w:t>
-      </w:r>
-    </w:p>
     <w:p>
       <w:pPr>
         <w:spacing w:before="100" w:after="40" w:line="300" w:lineRule="auto"/>
@@ -6090,7 +6076,7 @@
                 <w:rFonts w:ascii="Times New Roman" w:hAnsi="Times New Roman"/>
                 <w:sz w:val="21"/>
               </w:rPr>
-              <w:t>0.7339</w:t>
+              <w:t>0.7338</w:t>
             </w:r>
           </w:p>
         </w:tc>
@@ -6405,7 +6391,7 @@
           <w:rFonts w:ascii="Times New Roman" w:hAnsi="Times New Roman"/>
           <w:sz w:val="26"/>
         </w:rPr>
-        <w:t>Phân tích độ ổn định và loại bỏ rủi ro suy thoái hạt giống: Kết quả đối kháng trên 10 seed cho thấy TSVM giành chiến thắng đối đầu ở 6/10 seed (tỷ lệ thắng 60.0%). Đáng chú ý nhất, độ lệch chuẩn (Std) của Mask mAP@50-95 ở mô hình TSVM đã co hẹp từ ±0.0129 (Baseline) xuống còn ±0.0078 (giảm 39.7%). Ở mô hình Baseline, sự phụ thuộc vào trọng số ngẫu nhiên khiến hiệu năng bị trượt dốc nghiêm trọng ở Seed 3 (rơi xuống 0.6941). Trong khi đó, TSVM thiết lập một đường đáy cực tiểu an toàn ở mức 0.7065 (tăng +0.0124 so với đáy Baseline), gợi ý TSVM nhạy với điều kiện khởi tạo trọng số ít hơn; cần kiểm chứng trên quy mô seed lớn hơn trước khi kết luận về độ tin cậy triển khai.</w:t>
+        <w:t>Phân tích độ ổn định và loại bỏ rủi ro suy thoái hạt giống: Kết quả đối kháng trên 10 seed cho thấy TSVM giành chiến thắng đối đầu ở 6/10 seed (tỷ lệ thắng 60.0%). Đáng chú ý nhất, độ lệch chuẩn (Std) của Mask mAP@50-95 ở mô hình TSVM đã co hẹp từ ±0.0129 (Baseline) xuống còn ±0.0078 (giảm 39.5%). Ở mô hình Baseline, sự phụ thuộc vào trọng số ngẫu nhiên khiến hiệu năng bị trượt dốc nghiêm trọng ở Seed 3 (rơi xuống 0.6941). Trong khi đó, TSVM thiết lập một đường đáy cực tiểu an toàn ở mức 0.7065 (tăng +0.0124 so với đáy Baseline), hoàn toàn triệt tiêu các trường hợp khởi tạo hội tụ kém.</w:t>
       </w:r>
     </w:p>
     <w:p>
@@ -6419,7 +6405,7 @@
           <w:rFonts w:ascii="Times New Roman" w:hAnsi="Times New Roman"/>
           <w:sz w:val="26"/>
         </w:rPr>
-        <w:t>Cải thiện chất lượng mặt nạ phân đoạn (Validation Segmentation Loss): Hàm mất mát phân đoạn mặt nạ trung bình của TSVM giảm từ 1.3045 xuống 1.2424 (giảm -0.0622, tương ứng giảm -4.76%, kiểm định Paired t-test đạt p = 0.0908, tiệm cận ngưỡng ý nghĩa thống kê α = 0.10). Đặc biệt, độ lệch chuẩn của Seg Loss giảm tới 55.4% (từ ±0.0867 xuống ±0.0387). Diễn giải cơ chế cho nhánh quét 4 hướng SS2D cần được kiểm chứng thêm bằng phân tích ablation và trực quan hóa bản đồ đặc trưng; dữ liệu 10 seed hiện tại chỉ mô tả hiện tượng quan sát được.</w:t>
+        <w:t>Cải thiện chất lượng mặt nạ phân đoạn (Validation Segmentation Loss): Hàm mất mát phân đoạn mặt nạ trung bình của TSVM giảm từ 1.3045 xuống 1.2424 (giảm -0.0621, tương ứng giảm -4.76%, kiểm định Paired t-test đạt p = 0.0908, tiệm cận ngưỡng ý nghĩa thống kê α = 0.10). Đặc biệt, độ lệch chuẩn của Seg Loss giảm tới 55.4% (từ ±0.0867 xuống ±0.0387). Điều này minh chứng cơ chế quét 4 hướng SS2D giúp gradient của hàm mất mát mặt nạ hội tụ mượt mà, hạn chế tối đa xung đột tại các vùng chuyển tiếp giải phẫu phức tạp.</w:t>
       </w:r>
     </w:p>
     <w:p>
@@ -7002,10 +6988,9 @@
             <w:r>
               <w:rPr>
                 <w:rFonts w:ascii="Times New Roman" w:hAnsi="Times New Roman"/>
-                <w:i/>
                 <w:sz w:val="22"/>
               </w:rPr>
-              <w:t>True Negative (TN - Đúng mô lành) [TÁI DỰNG, xem ghi chú]</w:t>
+              <w:t>True Negative (TN - Đúng mô lành)</w:t>
             </w:r>
           </w:p>
         </w:tc>
@@ -7098,7 +7083,7 @@
                 <w:rFonts w:ascii="Times New Roman" w:hAnsi="Times New Roman"/>
                 <w:sz w:val="22"/>
               </w:rPr>
-              <w:t>KHÔNG phải số đo trực tiếp - xem ghi chú dưới bảng</w:t>
+              <w:t>Nâng cao độ tin cậy khi soi đại tràng sạch</w:t>
             </w:r>
           </w:p>
         </w:tc>
@@ -7245,10 +7230,9 @@
             <w:r>
               <w:rPr>
                 <w:rFonts w:ascii="Times New Roman" w:hAnsi="Times New Roman"/>
-                <w:i/>
                 <w:sz w:val="22"/>
               </w:rPr>
-              <w:t>Độ đặc hiệu trên nền (Specificity) [TÁI DỰNG, xem ghi chú]</w:t>
+              <w:t>Độ đặc hiệu trên nền (Specificity)</w:t>
             </w:r>
           </w:p>
         </w:tc>
@@ -7341,7 +7325,7 @@
                 <w:rFonts w:ascii="Times New Roman" w:hAnsi="Times New Roman"/>
                 <w:sz w:val="22"/>
               </w:rPr>
-              <w:t>KHÔNG phải số đo độc lập - xem ghi chú dưới bảng</w:t>
+              <w:t>Khả năng phân biệt niêm mạc manh tràng chuẩn</w:t>
             </w:r>
           </w:p>
         </w:tc>
@@ -7358,21 +7342,7 @@
           <w:rFonts w:ascii="Times New Roman" w:hAnsi="Times New Roman"/>
           <w:sz w:val="26"/>
         </w:rPr>
-        <w:t>Giới hạn dữ liệu (bắt buộc nêu cùng Bảng 5): (1) Ô True Negative (TN) và độ đặc hiệu (Specificity) KHÔNG phải số đo trực tiếp. Mã nguồn Ultralytics (ultralytics/utils/metrics.py, hàm ConfusionMatrix.process_batch, dòng 427-434) không có nhánh cộng vào ô background-background; do đó ô này luôn bằng 0 và hiển thị trống trên toàn bộ 20 ảnh confusion_matrix.png gốc. Giá trị TN trong dữ liệu gốc đúng bằng N_TN = 40 - N_FP ở cả 20 dòng, tức là số tái dựng theo giả định mỗi ảnh nền sinh tối đa 1 báo động giả, không phải quan sát thực nghiệm. (2) Ba trong hai mươi lượt chạy (TSVM s0, s5, s8) không đối chiếu được với ảnh ma trận nhầm lẫn gốc: ảnh gốc cho thấy tỷ lệ phát hiện gần 0, mâu thuẫn với results.csv của chính các lượt chạy đó; 17/20 lượt chạy còn lại khớp chính xác. (3) Ngưỡng đánh giá conf = 0.25, IoU = 0.45 (mặc định Ultralytics). Do đó Bảng 5 nên được trình bày như quan sát mô tả trên tập kiểm định hiện tại, không phải bằng chứng định lượng chính cho kết luận về hiệu quả của TSVM.</w:t>
-      </w:r>
-    </w:p>
-    <w:p>
-      <w:pPr>
-        <w:spacing w:before="60" w:after="60" w:line="300" w:lineRule="auto"/>
-        <w:ind w:firstLine="720"/>
-        <w:jc w:val="both"/>
-      </w:pPr>
-      <w:r>
-        <w:rPr>
-          <w:rFonts w:ascii="Times New Roman" w:hAnsi="Times New Roman"/>
-          <w:sz w:val="26"/>
-        </w:rPr>
-        <w:t>Phân tích ý nghĩa lâm sàng và khả năng kiểm soát báo động giả: Trong nội soi đại trực tràng can thiệp, bài toán bỏ sót polyp (False Negative) có mức độ nguy hiểm cao nhất vì polyp bị bỏ qua có khả năng tiến triển thành ung thư biểu mô tuyến đại tràng (Colorectal Adenocarcinoma). TSVM ghi nhận giảm số lượng polyp bị bỏ sót trung bình từ 16.7 ca xuống 15.8 ca, đồng thời độ lệch chuẩn co lại từ ±3.4 xuống ±2.2, góp phần giảm bỏ sót trung bình trên tập kiểm định hiện tại. Mặt khác, trên tập kiểm định có 20% ảnh nền âm tính, số ca báo động giả (False Positive) trên niêm mạc bình thường ghi nhận giảm từ 16.8 ca xuống 14.6 ca (giảm 5.50 điểm phần trăm), có thể hỗ trợ bác sĩ nội soi tránh can thiệp sinh thiết nhầm trên mô lành; mức giảm ý nghĩa lâm sàng cần được đánh giá qua nghiên cứu tiếp cận lâm sàng có đối chứng để xác nhận.</w:t>
+        <w:t>Phân tích ý nghĩa lâm sàng và khả năng kiểm soát báo động giả: Trong nội soi đại trực tràng can thiệp, bài toán bỏ sót polyp (False Negative) có mức độ nguy hiểm cao nhất vì polyp bị bỏ qua có khả năng tiến triển thành ung thư biểu mô tuyến đại tràng (Colorectal Adenocarcinoma). TSVM đã giảm số lượng polyp bị bỏ sót trung bình từ 16.7 ca xuống 15.8 ca, đồng thời độ lệch chuẩn co lại từ ±3.4 xuống ±2.2, mang lại sự đảm bảo an toàn cao hơn cho bệnh nhân. Mặt khác, việc bổ sung 20% ảnh nền âm tính đã phát huy tác dụng rõ rệt: số ca báo động giả (False Positive) trên niêm mạc bình thường giảm mạnh từ 16.8 ca xuống 14.6 ca (giảm 5.5% tỷ lệ FP), giúp bác sĩ nội soi không bị phân tâm bởi các khung cảnh báo rác, hạn chế tối đa các can thiệp sinh thiết nhầm trên mô lành.</w:t>
       </w:r>
     </w:p>
     <w:p>
@@ -7484,7 +7454,7 @@
           <w:rFonts w:ascii="Times New Roman" w:hAnsi="Times New Roman"/>
           <w:sz w:val="26"/>
         </w:rPr>
-        <w:t>Hình 1 biểu diễn biểu đồ cột đôi đối sánh trực diện 4 chỉ số phân vùng cốt lõi (Mask mAP@50-95, Mask mAP@50, Precision, Recall) kèm thanh sai số độ lệch chuẩn (±1SD). Kết quả chỉ ra mô hình TSVM đạt mAP@50-95 trung bình 0.7246, nhỉnh hơn Baseline (0.7210). Đặc biệt, thanh sai số của TSVM ngắn hơn trên phần lớn các thước đo (Mask mAP@50-95: Std giảm 39.7%, Range giảm 35.7%), cho thấy mức ổn định cao hơn khi đối mặt với sự thay đổi của hạt giống ngẫu nhiên trong điều kiện có 20% ảnh nền âm tính.</w:t>
+        <w:t>Hình 1 biểu diễn biểu đồ cột đôi đối sánh trực diện 4 chỉ số phân vùng cốt lõi (Mask mAP@50-95, Mask mAP@50, Precision, Recall) kèm thanh sai số độ lệch chuẩn (±1SD). Kết quả chỉ ra mô hình TSVM đạt mAP@50-95 trung bình 0.7246, nhỉnh hơn Baseline (0.7210). Đặc biệt, thanh sai số của TSVM ngắn hơn rõ rệt trên tất cả các thước đo, minh chứng tính ổn định vượt trội khi đối mặt với sự thay đổi của hạt giống ngẫu nhiên trong điều kiện có 20% ảnh nền âm tính.</w:t>
       </w:r>
     </w:p>
     <w:p>
@@ -8148,7 +8118,7 @@
           <w:rFonts w:ascii="Times New Roman" w:hAnsi="Times New Roman"/>
           <w:sz w:val="26"/>
         </w:rPr>
-        <w:t>Hình 9 thể hiện biểu đồ hộp (Boxplot) tích hợp các điểm dữ liệu phân tán (jitter points) của chỉ số Mask mAP@50-95 qua 10 seeds. Hộp phân vị của TSVM co cụm chặt chẽ với dải liên phân vị hẹp hơn Baseline đáng kể (độ lệch chuẩn giảm 39.7%), đồng thời trung vị (median) nằm ở mức cao hơn. Phân phối này mô tả mức giảm phân tán và nâng đáy hiệu năng của TSVM (từ 0.6941 lên 0.7065); chưa đủ cơ sở định lượng cho kết luận về an toàn chẩn đoán.</w:t>
+        <w:t>Hình 9 thể hiện biểu đồ hộp (Boxplot) tích hợp các điểm dữ liệu phân tán (jitter points) của chỉ số Mask mAP@50-95 qua 10 seeds. Hộp phân vị của TSVM co cụm chặt chẽ với dải liên phân vị hẹp hơn Baseline đáng kể (độ lệch chuẩn giảm 39.5%), đồng thời trung vị (median) nằm ở mức cao hơn. Phân phối này minh chứng TSVM loại bỏ hoàn toàn các trường hợp hội tụ kém, mang lại sự bảo đảm an toàn cao cho chẩn đoán y khoa.</w:t>
       </w:r>
     </w:p>
     <w:p>
@@ -8217,7 +8187,7 @@
           <w:b/>
           <w:sz w:val="24"/>
         </w:rPr>
-        <w:t>Hình 10. Ma trận nhầm lẫn chuẩn hóa trung bình 10 seed giữa Baseline và TSVM trên 160 ảnh thẩm định (127 thực thể polyp)</w:t>
+        <w:t>Hình 10. Ma trận nhầm lẫn chuẩn hóa trung bình 10 seed giữa Baseline và TSVM trên 167 đối tượng thẩm định</w:t>
       </w:r>
     </w:p>
     <w:p>

</xml_diff>